<commit_message>
Restructure to value-first/legal-last; redesign cover as a proposal
- Reorder body: What we'll do for you -> How we'll work together -> Fees &
  billing -> Our service commitment -> Terms and Conditions (page-break banner
  grouping all legal) -> Agreement & signature
- Rename headings to client-friendly language
- Cover: retitle to 'Engagement Proposal & Agreement / Prepared exclusively
  for', add value tagline and service proof-points line
- Applied to hourly, fixed, and master versions

Co-Authored-By: Claude Opus 4.8 <noreply@anthropic.com>
Claude-Session: https://claude.ai/code/session_01DN4EejCmNTZeYY4X9coMuA
</commit_message>
<xml_diff>
--- a/Onyx_Engagement_Letter_FIXED.docx
+++ b/Onyx_Engagement_Letter_FIXED.docx
@@ -193,17 +193,11 @@
         </w:rPr>
       </w:pPr>
       <w:r>
-        <w:t>Engagement letter</w:t>
+        <w:t xml:space="preserve">Engagement Proposal &amp; Agreement</w:t>
       </w:r>
       <w:r>
         <w:br/>
-        <w:t>tailored for</w:t>
-      </w:r>
-      <w:r>
-        <w:rPr>
-          <w:szCs w:val="32"/>
-        </w:rPr>
-        <w:t>:</w:t>
+        <w:t xml:space="preserve">Prepared exclusively for</w:t>
       </w:r>
     </w:p>
     <w:p>
@@ -266,12 +260,21 @@
         <w:pStyle w:val="CLAProNormalNoSpaceAfter"/>
         <w:ind w:left="4140"/>
       </w:pPr>
+      <w:r>
+        <w:rPr>
+          <w:i/>
+        </w:rPr>
+        <w:t xml:space="preserve">The accounting department your business deserves — without the cost and overhead of building one in-house.</w:t>
+      </w:r>
     </w:p>
     <w:p>
       <w:pPr>
         <w:pStyle w:val="CLAProNormalNoSpaceAfter"/>
         <w:ind w:left="4140"/>
       </w:pPr>
+      <w:r>
+        <w:t xml:space="preserve">Day-to-day bookkeeping   ·   Controller-level oversight   ·   Cash-flow management   ·   Always-on advisory</w:t>
+      </w:r>
     </w:p>
     <w:p>
       <w:pPr>
@@ -414,7 +417,6 @@
         <w:fldChar w:fldCharType="end"/>
       </w:r>
     </w:p>
-    <w:bookmarkStart w:id="1" w:name="Text36"/>
     <w:p>
       <w:pPr>
         <w:pStyle w:val="CLALTRAddressorSignature"/>
@@ -487,7 +489,6 @@
         <w:t xml:space="preserve">   </w:t>
       </w:r>
     </w:p>
-    <w:bookmarkStart w:id="2" w:name="Text46"/>
     <w:p>
       <w:pPr>
         <w:pStyle w:val="CLALTRAddressorSignature"/>
@@ -891,7 +892,7 @@
         <w:jc w:val="both"/>
       </w:pPr>
       <w:r>
-        <w:t>Scope of professional services</w:t>
+        <w:t xml:space="preserve">What we’ll do for you</w:t>
       </w:r>
     </w:p>
     <w:p>
@@ -1655,427 +1656,12 @@
       <w:pPr>
         <w:pStyle w:val="CLALTRHeading1"/>
         <w:jc w:val="both"/>
-      </w:pPr>
-      <w:r>
-        <w:t>Engagement objectives, limitations, and responsibilities</w:t>
-      </w:r>
-    </w:p>
-    <w:p>
-      <w:pPr>
-        <w:pStyle w:val="CLALTRNormal"/>
-        <w:jc w:val="both"/>
-      </w:pPr>
-      <w:r>
-        <w:t xml:space="preserve">The objective of ONYX’s engagement is to assist the Client in the preparation of financial statements by providing the services identified above. ONYX has not been engaged to prepare financial statements, and financial statements will not be presented to the Client. Financial statements that may be generated from the Client’s accounting system have not been prepared, compiled, reviewed, or audited by ONYX and, accordingly, will not include an opinion or any other form of assurance. The financial statements will not be accompanied by a report, and ONYX should not be discussed or associated with them. Any analysis or presentation of financial information that ONYX provides to management is based on financial statements generated from the Client’s accounting system and does not constitute the preparation, compilation, review, or audit of financial statements by ONYX.</w:t>
-      </w:r>
-    </w:p>
-    <w:p>
-      <w:pPr>
-        <w:pStyle w:val="CLALTRNormal"/>
-        <w:jc w:val="both"/>
-        <w:rPr>
-          <w:rStyle w:val="CLALTRNormalChar"/>
-        </w:rPr>
-      </w:pPr>
-      <w:r>
-        <w:rPr>
-          <w:rStyle w:val="CLALTRNormalChar"/>
-        </w:rPr>
-        <w:t>Material departures from accounting principles generally accepted in the United States of America (</w:t>
-      </w:r>
-      <w:r>
-        <w:rPr>
-          <w:rStyle w:val="CLALTRNormalChar"/>
-        </w:rPr>
-        <w:t xml:space="preserve">U.S. </w:t>
-      </w:r>
-      <w:r>
-        <w:rPr>
-          <w:rStyle w:val="CLALTRNormalChar"/>
-        </w:rPr>
-        <w:t>GAAP) or a special purpose framework may exist</w:t>
-      </w:r>
-      <w:r>
-        <w:rPr>
-          <w:rStyle w:val="CLALTRNormalChar"/>
-        </w:rPr>
-        <w:t>,</w:t>
-      </w:r>
-      <w:r>
-        <w:rPr>
-          <w:rStyle w:val="CLALTRNormalChar"/>
-        </w:rPr>
-        <w:t xml:space="preserve"> and the effects of those departures, if any, on the financial statements </w:t>
-      </w:r>
-      <w:r>
-        <w:rPr>
-          <w:rStyle w:val="CLALTRNormalChar"/>
-        </w:rPr>
-        <w:t>the Client</w:t>
-      </w:r>
-      <w:r>
-        <w:rPr>
-          <w:rStyle w:val="CLALTRNormalChar"/>
-        </w:rPr>
-        <w:t xml:space="preserve"> </w:t>
-      </w:r>
-      <w:r>
-        <w:rPr>
-          <w:rStyle w:val="CLALTRNormalChar"/>
-        </w:rPr>
-        <w:t>generate</w:t>
-      </w:r>
-      <w:r>
-        <w:rPr>
-          <w:rStyle w:val="CLALTRNormalChar"/>
-        </w:rPr>
-        <w:t>s</w:t>
-      </w:r>
-      <w:r>
-        <w:rPr>
-          <w:rStyle w:val="CLALTRNormalChar"/>
-        </w:rPr>
-        <w:t xml:space="preserve"> may not be disclosed. Because of the extent of material departures that may exist in, or required disclosures that may be omitted from, the financial statements </w:t>
-      </w:r>
-      <w:r>
-        <w:rPr>
-          <w:rStyle w:val="CLALTRNormalChar"/>
-        </w:rPr>
-        <w:t>the Client</w:t>
-      </w:r>
-      <w:r>
-        <w:rPr>
-          <w:rStyle w:val="CLALTRNormalChar"/>
-        </w:rPr>
-        <w:t xml:space="preserve"> </w:t>
-      </w:r>
-      <w:r>
-        <w:rPr>
-          <w:rStyle w:val="CLALTRNormalChar"/>
-        </w:rPr>
-        <w:t>generate</w:t>
-      </w:r>
-      <w:r>
-        <w:rPr>
-          <w:rStyle w:val="CLALTRNormalChar"/>
-        </w:rPr>
-        <w:t>s</w:t>
-      </w:r>
-      <w:r>
-        <w:rPr>
-          <w:rStyle w:val="CLALTRNormalChar"/>
-        </w:rPr>
-        <w:t xml:space="preserve">, </w:t>
-      </w:r>
-      <w:r>
-        <w:rPr>
-          <w:rStyle w:val="CLALTRNormalChar"/>
-        </w:rPr>
-        <w:t>ONYX</w:t>
-      </w:r>
-      <w:r>
-        <w:rPr>
-          <w:rStyle w:val="CLALTRNormalChar"/>
-        </w:rPr>
-        <w:t xml:space="preserve"> </w:t>
-      </w:r>
-      <w:r>
-        <w:rPr>
-          <w:rStyle w:val="CLALTRNormalChar"/>
-        </w:rPr>
-        <w:t>make</w:t>
-      </w:r>
-      <w:r>
-        <w:rPr>
-          <w:rStyle w:val="CLALTRNormalChar"/>
-        </w:rPr>
-        <w:t>s</w:t>
-      </w:r>
-      <w:r>
-        <w:rPr>
-          <w:rStyle w:val="CLALTRNormalChar"/>
-        </w:rPr>
-        <w:t xml:space="preserve"> no representations regarding the appropriateness of such statements for </w:t>
-      </w:r>
-      <w:r>
-        <w:rPr>
-          <w:rStyle w:val="CLALTRNormalChar"/>
-        </w:rPr>
-        <w:t>the Client’s</w:t>
-      </w:r>
-      <w:r>
-        <w:rPr>
-          <w:rStyle w:val="CLALTRNormalChar"/>
-        </w:rPr>
-        <w:t xml:space="preserve"> </w:t>
-      </w:r>
-      <w:r>
-        <w:rPr>
-          <w:rStyle w:val="CLALTRNormalChar"/>
-        </w:rPr>
-        <w:t xml:space="preserve">intended use or for any other purpose. Moreover, because of the nature of </w:t>
-      </w:r>
-      <w:r>
-        <w:rPr>
-          <w:rStyle w:val="CLALTRNormalChar"/>
-        </w:rPr>
-        <w:t>ONYX’s</w:t>
-      </w:r>
-      <w:r>
-        <w:rPr>
-          <w:rStyle w:val="CLALTRNormalChar"/>
-        </w:rPr>
-        <w:t xml:space="preserve"> </w:t>
-      </w:r>
-      <w:r>
-        <w:rPr>
-          <w:rStyle w:val="CLALTRNormalChar"/>
-        </w:rPr>
-        <w:t xml:space="preserve">engagement, </w:t>
-      </w:r>
-      <w:r>
-        <w:rPr>
-          <w:rStyle w:val="CLALTRNormalChar"/>
-        </w:rPr>
-        <w:t>ONYX</w:t>
-      </w:r>
-      <w:r>
-        <w:rPr>
-          <w:rStyle w:val="CLALTRNormalChar"/>
-        </w:rPr>
-        <w:t xml:space="preserve"> </w:t>
-      </w:r>
-      <w:r>
-        <w:rPr>
-          <w:rStyle w:val="CLALTRNormalChar"/>
-        </w:rPr>
-        <w:t>is</w:t>
-      </w:r>
-      <w:r>
-        <w:rPr>
-          <w:rStyle w:val="CLALTRNormalChar"/>
-        </w:rPr>
-        <w:t xml:space="preserve"> not responsible for communicating any such departures or omissions to </w:t>
-      </w:r>
-      <w:r>
-        <w:rPr>
-          <w:rStyle w:val="CLALTRNormalChar"/>
-        </w:rPr>
-        <w:t>the Client</w:t>
-      </w:r>
-      <w:r>
-        <w:rPr>
-          <w:rStyle w:val="CLALTRNormalChar"/>
-        </w:rPr>
-        <w:t>.</w:t>
-      </w:r>
-    </w:p>
-    <w:p>
-      <w:pPr>
-        <w:pStyle w:val="CLALTRNormal"/>
-        <w:jc w:val="both"/>
-      </w:pPr>
-      <w:r>
-        <w:t xml:space="preserve">ONYX’s </w:t>
-      </w:r>
-      <w:r>
-        <w:t xml:space="preserve">engagement cannot be relied upon to identify or disclose any financial statement misstatements, including those caused by fraud or error, or to identify or disclose any wrongdoing within </w:t>
-      </w:r>
-      <w:r>
-        <w:t>the Client</w:t>
-      </w:r>
-      <w:r>
-        <w:t xml:space="preserve"> or noncompliance with laws and regulations. </w:t>
-      </w:r>
-      <w:r>
-        <w:t>ONYX has</w:t>
-      </w:r>
-      <w:r>
-        <w:t xml:space="preserve"> no responsibility to identify and communicate deficiencies in </w:t>
-      </w:r>
-      <w:r>
-        <w:t xml:space="preserve">the Client’s </w:t>
-      </w:r>
-      <w:r>
-        <w:t xml:space="preserve">internal control as part of </w:t>
-      </w:r>
-      <w:r>
-        <w:t xml:space="preserve">ONYX’s </w:t>
-      </w:r>
-      <w:r>
-        <w:t xml:space="preserve">engagement. </w:t>
-      </w:r>
-      <w:r>
-        <w:t>The Client</w:t>
-      </w:r>
-      <w:r>
-        <w:t xml:space="preserve"> </w:t>
-      </w:r>
-      <w:r>
-        <w:t>agree</w:t>
-      </w:r>
-      <w:r>
-        <w:t>s</w:t>
-      </w:r>
-      <w:r>
-        <w:t xml:space="preserve"> that </w:t>
-      </w:r>
-      <w:r>
-        <w:t>ONYX</w:t>
-      </w:r>
-      <w:r>
-        <w:t xml:space="preserve"> </w:t>
-      </w:r>
-      <w:r>
-        <w:t xml:space="preserve">shall not be responsible for any </w:t>
-      </w:r>
-      <w:proofErr w:type="gramStart"/>
-      <w:r>
-        <w:t>misstatements</w:t>
-      </w:r>
-      <w:proofErr w:type="gramEnd"/>
-      <w:r>
-        <w:t xml:space="preserve"> in the </w:t>
-      </w:r>
-      <w:r>
-        <w:t>Client’s</w:t>
-      </w:r>
-      <w:r>
-        <w:t xml:space="preserve"> </w:t>
-      </w:r>
-      <w:r>
-        <w:t xml:space="preserve">financial statements that may </w:t>
-      </w:r>
-      <w:r>
-        <w:t>not be identified</w:t>
-      </w:r>
-      <w:r>
-        <w:t xml:space="preserve"> </w:t>
-      </w:r>
-      <w:proofErr w:type="gramStart"/>
-      <w:r>
-        <w:t>as a result of</w:t>
-      </w:r>
-      <w:proofErr w:type="gramEnd"/>
-      <w:r>
-        <w:t xml:space="preserve"> misrepresentations made to </w:t>
-      </w:r>
-      <w:r>
-        <w:t>ONYX</w:t>
-      </w:r>
-      <w:r>
-        <w:t xml:space="preserve"> </w:t>
-      </w:r>
-      <w:r>
-        <w:t xml:space="preserve">by </w:t>
-      </w:r>
-      <w:r>
-        <w:t>the Client</w:t>
-      </w:r>
-      <w:r>
-        <w:t>.</w:t>
-      </w:r>
-    </w:p>
-    <w:p>
-      <w:pPr>
-        <w:pStyle w:val="CLALTRNormalIndent"/>
-        <w:ind w:left="0"/>
-        <w:jc w:val="both"/>
-      </w:pPr>
-      <w:r>
-        <w:t xml:space="preserve">For all accounting services </w:t>
-      </w:r>
-      <w:r>
-        <w:t xml:space="preserve">ONYX </w:t>
-      </w:r>
-      <w:r>
-        <w:t xml:space="preserve">may provide to </w:t>
-      </w:r>
-      <w:r>
-        <w:t>the Client</w:t>
-      </w:r>
-      <w:r>
-        <w:t xml:space="preserve">, including assistance with the preparation of </w:t>
-      </w:r>
-      <w:r>
-        <w:t xml:space="preserve">the Client’s </w:t>
-      </w:r>
-      <w:r>
-        <w:t>financial statements, management agrees to assume all management responsibilities; oversee the services; evaluate the adequacy and results of the services; and accept responsibility for the results of the services.</w:t>
-      </w:r>
-    </w:p>
-    <w:p>
-      <w:pPr>
-        <w:pStyle w:val="CLALTRNormal"/>
-        <w:jc w:val="both"/>
-      </w:pPr>
-      <w:r>
-        <w:t xml:space="preserve">The Client understands that ONYX is only engaged by the Client. If the Client is a </w:t>
-      </w:r>
-      <w:r>
-        <w:t>business entity</w:t>
-      </w:r>
-      <w:r>
-        <w:t xml:space="preserve">, then ONYX does NOT also represent any of the Client’s individual partners, members, officers, directors or employees (as the case may be) or any other entities whose interests are represented by those </w:t>
-      </w:r>
-      <w:proofErr w:type="gramStart"/>
-      <w:r>
-        <w:t>persons</w:t>
-      </w:r>
-      <w:proofErr w:type="gramEnd"/>
-      <w:r>
-        <w:t>, unless ONYX agrees to do so in writing.</w:t>
-      </w:r>
-    </w:p>
-    <w:p>
-      <w:pPr>
-        <w:pStyle w:val="CLALTRNormal"/>
-        <w:jc w:val="both"/>
-      </w:pPr>
-      <w:r>
-        <w:t xml:space="preserve">If the Client is a business entity, </w:t>
-      </w:r>
-      <w:r>
-        <w:t>then, for the convenience of all involved, you have authorized the persons designated in this letter to act for you in a representative capacity in communicating your instructions to us.</w:t>
-      </w:r>
-    </w:p>
-    <w:p>
-      <w:pPr>
-        <w:pStyle w:val="CLALTRHeading1"/>
-        <w:jc w:val="both"/>
-        <w:rPr>
-          <w:highlight w:val="yellow"/>
-        </w:rPr>
-      </w:pPr>
-      <w:r>
-        <w:rPr>
-          <w:highlight w:val="yellow"/>
-        </w:rPr>
-        <w:t>The Client’s</w:t>
-      </w:r>
-      <w:r>
-        <w:rPr>
-          <w:highlight w:val="yellow"/>
-        </w:rPr>
-        <w:t xml:space="preserve"> responsibilities relevant to </w:t>
-      </w:r>
-      <w:r>
-        <w:rPr>
-          <w:highlight w:val="yellow"/>
-        </w:rPr>
-        <w:t>ONYX</w:t>
-      </w:r>
-      <w:r>
-        <w:rPr>
-          <w:highlight w:val="yellow"/>
-        </w:rPr>
-        <w:t xml:space="preserve">’s access to </w:t>
-      </w:r>
-      <w:r>
-        <w:rPr>
-          <w:highlight w:val="yellow"/>
-        </w:rPr>
-        <w:t>the Client’s monies</w:t>
+        <w:rPr>
+          <w:highlight w:val="yellow"/>
+        </w:rPr>
+      </w:pPr>
+      <w:r>
+        <w:t xml:space="preserve">How we’ll work together</w:t>
       </w:r>
     </w:p>
     <w:p>
@@ -2268,7 +1854,7 @@
         <w:jc w:val="both"/>
       </w:pPr>
       <w:r>
-        <w:t>Fees, time estimates, and terms</w:t>
+        <w:t xml:space="preserve">Fees &amp; billing</w:t>
       </w:r>
     </w:p>
     <w:p>
@@ -3234,6 +2820,508 @@
     </w:p>
     <w:p>
       <w:pPr>
+        <w:pStyle w:val="CLALTRHeading1"/>
+        <w:jc w:val="both"/>
+      </w:pPr>
+      <w:r>
+        <w:t xml:space="preserve">Our service commitment</w:t>
+      </w:r>
+    </w:p>
+    <w:p>
+      <w:pPr>
+        <w:pStyle w:val="CLALTRNormal"/>
+        <w:jc w:val="both"/>
+      </w:pPr>
+      <w:r>
+        <w:t xml:space="preserve">We stand behind our work. Upon full payment of our invoice, we will consider you satisfied with our services and our service commitment fulfilled.</w:t>
+      </w:r>
+    </w:p>
+    <w:p>
+      <w:pPr>
+        <w:pStyle w:val="CLALTRNormal"/>
+        <w:jc w:val="both"/>
+      </w:pPr>
+      <w:r>
+        <w:t xml:space="preserve">To ensure that </w:t>
+      </w:r>
+      <w:r>
+        <w:t xml:space="preserve">ONYX’s </w:t>
+      </w:r>
+      <w:r>
+        <w:t xml:space="preserve">services remain responsive to </w:t>
+      </w:r>
+      <w:r>
+        <w:t xml:space="preserve">the Client’s </w:t>
+      </w:r>
+      <w:r>
+        <w:t xml:space="preserve">needs, as well as fair to both parties, </w:t>
+      </w:r>
+      <w:r>
+        <w:t xml:space="preserve">ONYX </w:t>
+      </w:r>
+      <w:r>
+        <w:t xml:space="preserve">will meet with </w:t>
+      </w:r>
+      <w:r>
+        <w:t xml:space="preserve">the Client </w:t>
+      </w:r>
+      <w:r>
+        <w:t>throughout the term of th</w:t>
+      </w:r>
+      <w:r>
+        <w:t>is</w:t>
+      </w:r>
+      <w:r>
+        <w:t xml:space="preserve"> agreement and, if necessary, revise or adjust the scope of the services to be provided and the fees to be charged.</w:t>
+      </w:r>
+      <w:r>
+        <w:t xml:space="preserve"> Such revisions or adjustments shall not be binding unless in writing and signed by both ONYX and the Client.</w:t>
+      </w:r>
+    </w:p>
+    <w:p>
+      <w:pPr>
+        <w:pStyle w:val="CLALTRNormal"/>
+        <w:jc w:val="both"/>
+      </w:pPr>
+      <w:r>
+        <w:t>Furthermore, it is understood that either party may terminate this agreement at any time, for any reason, by giving</w:t>
+      </w:r>
+      <w:r>
+        <w:t xml:space="preserve"> thirty</w:t>
+      </w:r>
+      <w:r>
+        <w:t xml:space="preserve"> </w:t>
+      </w:r>
+      <w:r>
+        <w:t>(</w:t>
+      </w:r>
+      <w:r>
+        <w:t>30</w:t>
+      </w:r>
+      <w:r>
+        <w:t>)</w:t>
+      </w:r>
+      <w:r>
+        <w:t xml:space="preserve"> </w:t>
+      </w:r>
+      <w:proofErr w:type="gramStart"/>
+      <w:r>
+        <w:t>days</w:t>
+      </w:r>
+      <w:proofErr w:type="gramEnd"/>
+      <w:r>
+        <w:t xml:space="preserve"> written notice to the other party. In that event, the provisions of this agreement shall continue to apply to all services rendered prior to termination. It is understood that any unpaid fees that are owed or invoices that are outstanding at the date of termination are to be paid in accordance with the terms of this agreement.</w:t>
+      </w:r>
+    </w:p>
+    <w:p>
+      <w:pPr>
+        <w:pStyle w:val="CLALTRHeading1"/>
+        <w:pageBreakBefore/>
+        <w:jc w:val="both"/>
+      </w:pPr>
+      <w:r>
+        <w:t xml:space="preserve">Terms and Conditions</w:t>
+      </w:r>
+    </w:p>
+    <w:p>
+      <w:pPr>
+        <w:pStyle w:val="CLALTRNormal"/>
+        <w:jc w:val="both"/>
+      </w:pPr>
+      <w:r>
+        <w:t xml:space="preserve">The following terms govern our engagement. They define each party’s responsibilities, allocate risk between us, and explain how any questions or disputes will be handled.</w:t>
+      </w:r>
+    </w:p>
+    <w:p>
+      <w:pPr>
+        <w:pStyle w:val="CLALTRHeading1"/>
+        <w:jc w:val="both"/>
+      </w:pPr>
+      <w:r>
+        <w:t>Engagement objectives, limitations, and responsibilities</w:t>
+      </w:r>
+    </w:p>
+    <w:p>
+      <w:pPr>
+        <w:pStyle w:val="CLALTRNormal"/>
+        <w:jc w:val="both"/>
+      </w:pPr>
+      <w:r>
+        <w:t xml:space="preserve">The objective of ONYX’s engagement is to assist the Client in the preparation of financial statements by providing the services identified above. ONYX has not been engaged to prepare financial statements, and financial statements will not be presented to the Client. Financial statements that may be generated from the Client’s accounting system have not been prepared, compiled, reviewed, or audited by ONYX and, accordingly, will not include an opinion or any other form of assurance. The financial statements will not be accompanied by a report, and ONYX should not be discussed or associated with them. Any analysis or presentation of financial information that ONYX provides to management is based on financial statements generated from the Client’s accounting system and does not constitute the preparation, compilation, review, or audit of financial statements by ONYX.</w:t>
+      </w:r>
+    </w:p>
+    <w:p>
+      <w:pPr>
+        <w:pStyle w:val="CLALTRNormal"/>
+        <w:jc w:val="both"/>
+        <w:rPr>
+          <w:rStyle w:val="CLALTRNormalChar"/>
+        </w:rPr>
+      </w:pPr>
+      <w:r>
+        <w:rPr>
+          <w:rStyle w:val="CLALTRNormalChar"/>
+        </w:rPr>
+        <w:t>Material departures from accounting principles generally accepted in the United States of America (</w:t>
+      </w:r>
+      <w:r>
+        <w:rPr>
+          <w:rStyle w:val="CLALTRNormalChar"/>
+        </w:rPr>
+        <w:t xml:space="preserve">U.S. </w:t>
+      </w:r>
+      <w:r>
+        <w:rPr>
+          <w:rStyle w:val="CLALTRNormalChar"/>
+        </w:rPr>
+        <w:t>GAAP) or a special purpose framework may exist</w:t>
+      </w:r>
+      <w:r>
+        <w:rPr>
+          <w:rStyle w:val="CLALTRNormalChar"/>
+        </w:rPr>
+        <w:t>,</w:t>
+      </w:r>
+      <w:r>
+        <w:rPr>
+          <w:rStyle w:val="CLALTRNormalChar"/>
+        </w:rPr>
+        <w:t xml:space="preserve"> and the effects of those departures, if any, on the financial statements </w:t>
+      </w:r>
+      <w:r>
+        <w:rPr>
+          <w:rStyle w:val="CLALTRNormalChar"/>
+        </w:rPr>
+        <w:t>the Client</w:t>
+      </w:r>
+      <w:r>
+        <w:rPr>
+          <w:rStyle w:val="CLALTRNormalChar"/>
+        </w:rPr>
+        <w:t xml:space="preserve"> </w:t>
+      </w:r>
+      <w:r>
+        <w:rPr>
+          <w:rStyle w:val="CLALTRNormalChar"/>
+        </w:rPr>
+        <w:t>generate</w:t>
+      </w:r>
+      <w:r>
+        <w:rPr>
+          <w:rStyle w:val="CLALTRNormalChar"/>
+        </w:rPr>
+        <w:t>s</w:t>
+      </w:r>
+      <w:r>
+        <w:rPr>
+          <w:rStyle w:val="CLALTRNormalChar"/>
+        </w:rPr>
+        <w:t xml:space="preserve"> may not be disclosed. Because of the extent of material departures that may exist in, or required disclosures that may be omitted from, the financial statements </w:t>
+      </w:r>
+      <w:r>
+        <w:rPr>
+          <w:rStyle w:val="CLALTRNormalChar"/>
+        </w:rPr>
+        <w:t>the Client</w:t>
+      </w:r>
+      <w:r>
+        <w:rPr>
+          <w:rStyle w:val="CLALTRNormalChar"/>
+        </w:rPr>
+        <w:t xml:space="preserve"> </w:t>
+      </w:r>
+      <w:r>
+        <w:rPr>
+          <w:rStyle w:val="CLALTRNormalChar"/>
+        </w:rPr>
+        <w:t>generate</w:t>
+      </w:r>
+      <w:r>
+        <w:rPr>
+          <w:rStyle w:val="CLALTRNormalChar"/>
+        </w:rPr>
+        <w:t>s</w:t>
+      </w:r>
+      <w:r>
+        <w:rPr>
+          <w:rStyle w:val="CLALTRNormalChar"/>
+        </w:rPr>
+        <w:t xml:space="preserve">, </w:t>
+      </w:r>
+      <w:r>
+        <w:rPr>
+          <w:rStyle w:val="CLALTRNormalChar"/>
+        </w:rPr>
+        <w:t>ONYX</w:t>
+      </w:r>
+      <w:r>
+        <w:rPr>
+          <w:rStyle w:val="CLALTRNormalChar"/>
+        </w:rPr>
+        <w:t xml:space="preserve"> </w:t>
+      </w:r>
+      <w:r>
+        <w:rPr>
+          <w:rStyle w:val="CLALTRNormalChar"/>
+        </w:rPr>
+        <w:t>make</w:t>
+      </w:r>
+      <w:r>
+        <w:rPr>
+          <w:rStyle w:val="CLALTRNormalChar"/>
+        </w:rPr>
+        <w:t>s</w:t>
+      </w:r>
+      <w:r>
+        <w:rPr>
+          <w:rStyle w:val="CLALTRNormalChar"/>
+        </w:rPr>
+        <w:t xml:space="preserve"> no representations regarding the appropriateness of such statements for </w:t>
+      </w:r>
+      <w:r>
+        <w:rPr>
+          <w:rStyle w:val="CLALTRNormalChar"/>
+        </w:rPr>
+        <w:t>the Client’s</w:t>
+      </w:r>
+      <w:r>
+        <w:rPr>
+          <w:rStyle w:val="CLALTRNormalChar"/>
+        </w:rPr>
+        <w:t xml:space="preserve"> </w:t>
+      </w:r>
+      <w:r>
+        <w:rPr>
+          <w:rStyle w:val="CLALTRNormalChar"/>
+        </w:rPr>
+        <w:t xml:space="preserve">intended use or for any other purpose. Moreover, because of the nature of </w:t>
+      </w:r>
+      <w:r>
+        <w:rPr>
+          <w:rStyle w:val="CLALTRNormalChar"/>
+        </w:rPr>
+        <w:t>ONYX’s</w:t>
+      </w:r>
+      <w:r>
+        <w:rPr>
+          <w:rStyle w:val="CLALTRNormalChar"/>
+        </w:rPr>
+        <w:t xml:space="preserve"> </w:t>
+      </w:r>
+      <w:r>
+        <w:rPr>
+          <w:rStyle w:val="CLALTRNormalChar"/>
+        </w:rPr>
+        <w:t xml:space="preserve">engagement, </w:t>
+      </w:r>
+      <w:r>
+        <w:rPr>
+          <w:rStyle w:val="CLALTRNormalChar"/>
+        </w:rPr>
+        <w:t>ONYX</w:t>
+      </w:r>
+      <w:r>
+        <w:rPr>
+          <w:rStyle w:val="CLALTRNormalChar"/>
+        </w:rPr>
+        <w:t xml:space="preserve"> </w:t>
+      </w:r>
+      <w:r>
+        <w:rPr>
+          <w:rStyle w:val="CLALTRNormalChar"/>
+        </w:rPr>
+        <w:t>is</w:t>
+      </w:r>
+      <w:r>
+        <w:rPr>
+          <w:rStyle w:val="CLALTRNormalChar"/>
+        </w:rPr>
+        <w:t xml:space="preserve"> not responsible for communicating any such departures or omissions to </w:t>
+      </w:r>
+      <w:r>
+        <w:rPr>
+          <w:rStyle w:val="CLALTRNormalChar"/>
+        </w:rPr>
+        <w:t>the Client</w:t>
+      </w:r>
+      <w:r>
+        <w:rPr>
+          <w:rStyle w:val="CLALTRNormalChar"/>
+        </w:rPr>
+        <w:t>.</w:t>
+      </w:r>
+    </w:p>
+    <w:p>
+      <w:pPr>
+        <w:pStyle w:val="CLALTRNormal"/>
+        <w:jc w:val="both"/>
+      </w:pPr>
+      <w:r>
+        <w:t xml:space="preserve">ONYX’s </w:t>
+      </w:r>
+      <w:r>
+        <w:t xml:space="preserve">engagement cannot be relied upon to identify or disclose any financial statement misstatements, including those caused by fraud or error, or to identify or disclose any wrongdoing within </w:t>
+      </w:r>
+      <w:r>
+        <w:t>the Client</w:t>
+      </w:r>
+      <w:r>
+        <w:t xml:space="preserve"> or noncompliance with laws and regulations. </w:t>
+      </w:r>
+      <w:r>
+        <w:t>ONYX has</w:t>
+      </w:r>
+      <w:r>
+        <w:t xml:space="preserve"> no responsibility to identify and communicate deficiencies in </w:t>
+      </w:r>
+      <w:r>
+        <w:t xml:space="preserve">the Client’s </w:t>
+      </w:r>
+      <w:r>
+        <w:t xml:space="preserve">internal control as part of </w:t>
+      </w:r>
+      <w:r>
+        <w:t xml:space="preserve">ONYX’s </w:t>
+      </w:r>
+      <w:r>
+        <w:t xml:space="preserve">engagement. </w:t>
+      </w:r>
+      <w:r>
+        <w:t>The Client</w:t>
+      </w:r>
+      <w:r>
+        <w:t xml:space="preserve"> </w:t>
+      </w:r>
+      <w:r>
+        <w:t>agree</w:t>
+      </w:r>
+      <w:r>
+        <w:t>s</w:t>
+      </w:r>
+      <w:r>
+        <w:t xml:space="preserve"> that </w:t>
+      </w:r>
+      <w:r>
+        <w:t>ONYX</w:t>
+      </w:r>
+      <w:r>
+        <w:t xml:space="preserve"> </w:t>
+      </w:r>
+      <w:r>
+        <w:t xml:space="preserve">shall not be responsible for any </w:t>
+      </w:r>
+      <w:proofErr w:type="gramStart"/>
+      <w:r>
+        <w:t>misstatements</w:t>
+      </w:r>
+      <w:proofErr w:type="gramEnd"/>
+      <w:r>
+        <w:t xml:space="preserve"> in the </w:t>
+      </w:r>
+      <w:r>
+        <w:t>Client’s</w:t>
+      </w:r>
+      <w:r>
+        <w:t xml:space="preserve"> </w:t>
+      </w:r>
+      <w:r>
+        <w:t xml:space="preserve">financial statements that may </w:t>
+      </w:r>
+      <w:r>
+        <w:t>not be identified</w:t>
+      </w:r>
+      <w:r>
+        <w:t xml:space="preserve"> </w:t>
+      </w:r>
+      <w:proofErr w:type="gramStart"/>
+      <w:r>
+        <w:t>as a result of</w:t>
+      </w:r>
+      <w:proofErr w:type="gramEnd"/>
+      <w:r>
+        <w:t xml:space="preserve"> misrepresentations made to </w:t>
+      </w:r>
+      <w:r>
+        <w:t>ONYX</w:t>
+      </w:r>
+      <w:r>
+        <w:t xml:space="preserve"> </w:t>
+      </w:r>
+      <w:r>
+        <w:t xml:space="preserve">by </w:t>
+      </w:r>
+      <w:r>
+        <w:t>the Client</w:t>
+      </w:r>
+      <w:r>
+        <w:t>.</w:t>
+      </w:r>
+    </w:p>
+    <w:p>
+      <w:pPr>
+        <w:pStyle w:val="CLALTRNormalIndent"/>
+        <w:ind w:left="0"/>
+        <w:jc w:val="both"/>
+      </w:pPr>
+      <w:r>
+        <w:t xml:space="preserve">For all accounting services </w:t>
+      </w:r>
+      <w:r>
+        <w:t xml:space="preserve">ONYX </w:t>
+      </w:r>
+      <w:r>
+        <w:t xml:space="preserve">may provide to </w:t>
+      </w:r>
+      <w:r>
+        <w:t>the Client</w:t>
+      </w:r>
+      <w:r>
+        <w:t xml:space="preserve">, including assistance with the preparation of </w:t>
+      </w:r>
+      <w:r>
+        <w:t xml:space="preserve">the Client’s </w:t>
+      </w:r>
+      <w:r>
+        <w:t>financial statements, management agrees to assume all management responsibilities; oversee the services; evaluate the adequacy and results of the services; and accept responsibility for the results of the services.</w:t>
+      </w:r>
+    </w:p>
+    <w:p>
+      <w:pPr>
+        <w:pStyle w:val="CLALTRNormal"/>
+        <w:jc w:val="both"/>
+      </w:pPr>
+      <w:r>
+        <w:t xml:space="preserve">The Client understands that ONYX is only engaged by the Client. If the Client is a </w:t>
+      </w:r>
+      <w:r>
+        <w:t>business entity</w:t>
+      </w:r>
+      <w:r>
+        <w:t xml:space="preserve">, then ONYX does NOT also represent any of the Client’s individual partners, members, officers, directors or employees (as the case may be) or any other entities whose interests are represented by those </w:t>
+      </w:r>
+      <w:proofErr w:type="gramStart"/>
+      <w:r>
+        <w:t>persons</w:t>
+      </w:r>
+      <w:proofErr w:type="gramEnd"/>
+      <w:r>
+        <w:t>, unless ONYX agrees to do so in writing.</w:t>
+      </w:r>
+    </w:p>
+    <w:p>
+      <w:pPr>
+        <w:pStyle w:val="CLALTRNormal"/>
+        <w:jc w:val="both"/>
+      </w:pPr>
+      <w:r>
+        <w:t xml:space="preserve">If the Client is a business entity, </w:t>
+      </w:r>
+      <w:r>
+        <w:t>then, for the convenience of all involved, you have authorized the persons designated in this letter to act for you in a representative capacity in communicating your instructions to us.</w:t>
+      </w:r>
+    </w:p>
+    <w:p>
+      <w:pPr>
         <w:pStyle w:val="CLALTRHeading2"/>
         <w:jc w:val="both"/>
       </w:pPr>
@@ -3504,101 +3592,6 @@
       </w:r>
       <w:r>
         <w:t xml:space="preserve"> not become aware of the existence or possible existence of a dispute.</w:t>
-      </w:r>
-    </w:p>
-    <w:p>
-      <w:pPr>
-        <w:pStyle w:val="CLALTRHeading1"/>
-        <w:jc w:val="both"/>
-      </w:pPr>
-      <w:r>
-        <w:t>Service satisfaction</w:t>
-      </w:r>
-    </w:p>
-    <w:p>
-      <w:pPr>
-        <w:pStyle w:val="CLALTRNormal"/>
-        <w:jc w:val="both"/>
-      </w:pPr>
-      <w:r>
-        <w:t xml:space="preserve">We stand behind our work. Upon full payment of our invoice, we will consider you satisfied with our services and our service commitment fulfilled.</w:t>
-      </w:r>
-    </w:p>
-    <w:p>
-      <w:pPr>
-        <w:pStyle w:val="CLALTRNormal"/>
-        <w:jc w:val="both"/>
-      </w:pPr>
-      <w:r>
-        <w:t xml:space="preserve">To ensure that </w:t>
-      </w:r>
-      <w:r>
-        <w:t xml:space="preserve">ONYX’s </w:t>
-      </w:r>
-      <w:r>
-        <w:t xml:space="preserve">services remain responsive to </w:t>
-      </w:r>
-      <w:r>
-        <w:t xml:space="preserve">the Client’s </w:t>
-      </w:r>
-      <w:r>
-        <w:t xml:space="preserve">needs, as well as fair to both parties, </w:t>
-      </w:r>
-      <w:r>
-        <w:t xml:space="preserve">ONYX </w:t>
-      </w:r>
-      <w:r>
-        <w:t xml:space="preserve">will meet with </w:t>
-      </w:r>
-      <w:r>
-        <w:t xml:space="preserve">the Client </w:t>
-      </w:r>
-      <w:r>
-        <w:t>throughout the term of th</w:t>
-      </w:r>
-      <w:r>
-        <w:t>is</w:t>
-      </w:r>
-      <w:r>
-        <w:t xml:space="preserve"> agreement and, if necessary, revise or adjust the scope of the services to be provided and the fees to be charged.</w:t>
-      </w:r>
-      <w:r>
-        <w:t xml:space="preserve"> Such revisions or adjustments shall not be binding unless in writing and signed by both ONYX and the Client.</w:t>
-      </w:r>
-    </w:p>
-    <w:p>
-      <w:pPr>
-        <w:pStyle w:val="CLALTRNormal"/>
-        <w:jc w:val="both"/>
-      </w:pPr>
-      <w:r>
-        <w:t>Furthermore, it is understood that either party may terminate this agreement at any time, for any reason, by giving</w:t>
-      </w:r>
-      <w:r>
-        <w:t xml:space="preserve"> thirty</w:t>
-      </w:r>
-      <w:r>
-        <w:t xml:space="preserve"> </w:t>
-      </w:r>
-      <w:r>
-        <w:t>(</w:t>
-      </w:r>
-      <w:r>
-        <w:t>30</w:t>
-      </w:r>
-      <w:r>
-        <w:t>)</w:t>
-      </w:r>
-      <w:r>
-        <w:t xml:space="preserve"> </w:t>
-      </w:r>
-      <w:proofErr w:type="gramStart"/>
-      <w:r>
-        <w:t>days</w:t>
-      </w:r>
-      <w:proofErr w:type="gramEnd"/>
-      <w:r>
-        <w:t xml:space="preserve"> written notice to the other party. In that event, the provisions of this agreement shall continue to apply to all services rendered prior to termination. It is understood that any unpaid fees that are owed or invoices that are outstanding at the date of termination are to be paid in accordance with the terms of this agreement.</w:t>
       </w:r>
     </w:p>
     <w:p>

</xml_diff>

<commit_message>
Add no-lock-in flexibility language for changing services
- New 'Adjusting your services as your needs change' subsection in the scope
  section: services can be added/reduced/adjusted via a brief addendum, fees
  adjust accordingly, all other terms remain, no need to start over
- Sharpen amendment clause to state scope/fees can change without re-executing
  the agreement (binding when in writing and signed by both)
- Applied to hourly, fixed, and master versions

Co-Authored-By: Claude Opus 4.8 <noreply@anthropic.com>
Claude-Session: https://claude.ai/code/session_01DN4EejCmNTZeYY4X9coMuA
</commit_message>
<xml_diff>
--- a/Onyx_Engagement_Letter_FIXED.docx
+++ b/Onyx_Engagement_Letter_FIXED.docx
@@ -1654,6 +1654,24 @@
     </w:p>
     <w:p>
       <w:pPr>
+        <w:pStyle w:val="CLALTRHeading2"/>
+        <w:jc w:val="both"/>
+      </w:pPr>
+      <w:r>
+        <w:t xml:space="preserve">Adjusting your services as your needs change</w:t>
+      </w:r>
+    </w:p>
+    <w:p>
+      <w:pPr>
+        <w:pStyle w:val="CLALTRNormal"/>
+        <w:jc w:val="both"/>
+      </w:pPr>
+      <w:r>
+        <w:t xml:space="preserve">Your needs will evolve as your business grows, and this engagement is built to flex with them. Services can be added, reduced, or adjusted at any time by mutual written agreement — typically a brief addendum to this letter rather than a new engagement letter — with fees adjusted accordingly. All other terms of this agreement remain in effect, so adding or removing a service never requires starting over.</w:t>
+      </w:r>
+    </w:p>
+    <w:p>
+      <w:pPr>
         <w:pStyle w:val="CLALTRHeading1"/>
         <w:jc w:val="both"/>
         <w:rPr>
@@ -2842,40 +2860,7 @@
         <w:jc w:val="both"/>
       </w:pPr>
       <w:r>
-        <w:t xml:space="preserve">To ensure that </w:t>
-      </w:r>
-      <w:r>
-        <w:t xml:space="preserve">ONYX’s </w:t>
-      </w:r>
-      <w:r>
-        <w:t xml:space="preserve">services remain responsive to </w:t>
-      </w:r>
-      <w:r>
-        <w:t xml:space="preserve">the Client’s </w:t>
-      </w:r>
-      <w:r>
-        <w:t xml:space="preserve">needs, as well as fair to both parties, </w:t>
-      </w:r>
-      <w:r>
-        <w:t xml:space="preserve">ONYX </w:t>
-      </w:r>
-      <w:r>
-        <w:t xml:space="preserve">will meet with </w:t>
-      </w:r>
-      <w:r>
-        <w:t xml:space="preserve">the Client </w:t>
-      </w:r>
-      <w:r>
-        <w:t>throughout the term of th</w:t>
-      </w:r>
-      <w:r>
-        <w:t>is</w:t>
-      </w:r>
-      <w:r>
-        <w:t xml:space="preserve"> agreement and, if necessary, revise or adjust the scope of the services to be provided and the fees to be charged.</w:t>
-      </w:r>
-      <w:r>
-        <w:t xml:space="preserve"> Such revisions or adjustments shall not be binding unless in writing and signed by both ONYX and the Client.</w:t>
+        <w:t xml:space="preserve">To ensure that ONYX’s services remain responsive to the Client’s needs, and fair to both parties, ONYX will meet with the Client throughout the term of this agreement and, as needs change, revise or adjust the scope of services and the related fees — without the need to re-execute this agreement. Such revisions or adjustments are not binding unless made in writing and signed by both ONYX and the Client.</w:t>
       </w:r>
     </w:p>
     <w:p>

</xml_diff>

<commit_message>
Rebuild Scope as 3-tier hybrid; add missing CFO tier
- Compared to two sent letters; draft was missing the CFO tier
- Hybrid format: value-lead sentence per tier + bullets
- Add CFO-level strategic support tier (strategic partner, advisory, budgeting/
  forecasting/modeling, financing & negotiation support, ownership insight)
- Move budgeting Controller->CFO; split bank bullet (routine vs negotiation)
- Adopt 'illustrative / not exhaustive / as needed or requested' framing
- Applied to hourly, fixed, and master versions

Co-Authored-By: Claude Opus 4.8 <noreply@anthropic.com>
Claude-Session: https://claude.ai/code/session_01DN4EejCmNTZeYY4X9coMuA
</commit_message>
<xml_diff>
--- a/Onyx_Engagement_Letter_FIXED.docx
+++ b/Onyx_Engagement_Letter_FIXED.docx
@@ -901,7 +901,7 @@
         <w:jc w:val="both"/>
       </w:pPr>
       <w:r>
-        <w:t xml:space="preserve">ONYX becomes the Client’s accounting department — without the cost, turnover, and overhead of building one in-house. Our team runs the day-to-day transaction work and layers on controller-level oversight, keeping the Client’s books accurate, current, and ready to drive decisions — so the Client’s leaders can spend their time running the business instead of chasing the numbers. Specifically, ONYX will perform the following services:</w:t>
+        <w:t xml:space="preserve">ONYX becomes the Client’s accounting department — without the cost and overhead of building one in-house. Working as needed or requested, our team delivers everything from day-to-day transaction processing to controller-level oversight to CFO-level strategic guidance, so the Client’s leaders can focus on running the business instead of chasing the numbers. The services below are illustrative of what ONYX provides and are not a fixed or exhaustive list; we tailor the mix to the Client’s needs and adjust it as those needs change.</w:t>
       </w:r>
     </w:p>
     <w:p>
@@ -932,6 +932,18 @@
           <w:highlight w:val="yellow"/>
         </w:rPr>
         <w:t xml:space="preserve">Day-to-day accounting operations</w:t>
+      </w:r>
+    </w:p>
+    <w:p>
+      <w:pPr>
+        <w:pStyle w:val="CLALTRNormal"/>
+        <w:jc w:val="both"/>
+      </w:pPr>
+      <w:r>
+        <w:rPr>
+          <w:highlight w:val="yellow"/>
+        </w:rPr>
+        <w:t xml:space="preserve">Our team handles the recurring transaction work that keeps the books accurate, current, and close-ready:</w:t>
       </w:r>
     </w:p>
     <w:p>
@@ -1094,6 +1106,18 @@
     <w:p>
       <w:pPr>
         <w:pStyle w:val="CLALTRNormal"/>
+        <w:jc w:val="both"/>
+      </w:pPr>
+      <w:r>
+        <w:rPr>
+          <w:highlight w:val="yellow"/>
+        </w:rPr>
+        <w:t xml:space="preserve">A second layer of review and reporting that turns clean books into insight, so management always has accurate, timely numbers to act on:</w:t>
+      </w:r>
+    </w:p>
+    <w:p>
+      <w:pPr>
+        <w:pStyle w:val="CLALTRNormal"/>
         <w:numPr>
           <w:ilvl w:val="0"/>
           <w:numId w:val="10"/>
@@ -1168,7 +1192,7 @@
         <w:rPr>
           <w:highlight w:val="yellow"/>
         </w:rPr>
-        <w:t xml:space="preserve">Build and support budgets that give the Client both a roadmap and a benchmark</w:t>
+        <w:t xml:space="preserve">Document the Client’s accounting processes and procedures</w:t>
       </w:r>
     </w:p>
     <w:p>
@@ -1184,7 +1208,7 @@
         <w:rPr>
           <w:highlight w:val="yellow"/>
         </w:rPr>
-        <w:t xml:space="preserve">Document the Client’s accounting processes and procedures</w:t>
+        <w:t xml:space="preserve">Continuously refine and strengthen those processes as the business grows</w:t>
       </w:r>
     </w:p>
     <w:p>
@@ -1200,7 +1224,7 @@
         <w:rPr>
           <w:highlight w:val="yellow"/>
         </w:rPr>
-        <w:t xml:space="preserve">Continuously refine and strengthen those processes as the business grows</w:t>
+        <w:t xml:space="preserve">Monitor and manage cash flow so the Client always knows what’s coming in and going out</w:t>
       </w:r>
     </w:p>
     <w:p>
@@ -1216,7 +1240,7 @@
         <w:rPr>
           <w:highlight w:val="yellow"/>
         </w:rPr>
-        <w:t xml:space="preserve">Monitor and manage cash flow so the Client always knows what’s coming in and going out</w:t>
+        <w:t xml:space="preserve">Assist with bank communications and routine information requests</w:t>
       </w:r>
     </w:p>
     <w:p>
@@ -1232,7 +1256,35 @@
         <w:rPr>
           <w:highlight w:val="yellow"/>
         </w:rPr>
-        <w:t xml:space="preserve">Stand alongside the Client in bank communications and negotiations</w:t>
+        <w:t xml:space="preserve">Gather and organize everything the Client’s tax preparer needs for the annual return</w:t>
+      </w:r>
+    </w:p>
+    <w:p>
+      <w:pPr>
+        <w:pStyle w:val="CLALTRNormal"/>
+        <w:numPr>
+          <w:ilvl w:val="0"/>
+          <w:numId w:val="8"/>
+        </w:numPr>
+        <w:jc w:val="both"/>
+      </w:pPr>
+      <w:r>
+        <w:rPr>
+          <w:highlight w:val="yellow"/>
+        </w:rPr>
+        <w:t xml:space="preserve">CFO-level strategic support</w:t>
+      </w:r>
+    </w:p>
+    <w:p>
+      <w:pPr>
+        <w:pStyle w:val="CLALTRNormal"/>
+        <w:jc w:val="both"/>
+      </w:pPr>
+      <w:r>
+        <w:rPr>
+          <w:highlight w:val="yellow"/>
+        </w:rPr>
+        <w:t xml:space="preserve">On an as-needed or as-requested basis, ONYX serves as the Client’s strategic financial partner, providing the guidance, perspective, and forward-looking planning of a CFO without the full-time cost:</w:t>
       </w:r>
     </w:p>
     <w:p>
@@ -1248,7 +1300,71 @@
         <w:rPr>
           <w:highlight w:val="yellow"/>
         </w:rPr>
-        <w:t xml:space="preserve">Gather and organize everything the Client’s tax preparer needs for the annual return</w:t>
+        <w:t xml:space="preserve">Serve as a strategic financial partner to ownership and management, offering guidance and direction across the finance function</w:t>
+      </w:r>
+    </w:p>
+    <w:p>
+      <w:pPr>
+        <w:pStyle w:val="CLALTRNormal"/>
+        <w:numPr>
+          <w:ilvl w:val="0"/>
+          <w:numId w:val="10"/>
+        </w:numPr>
+        <w:jc w:val="both"/>
+      </w:pPr>
+      <w:r>
+        <w:rPr>
+          <w:highlight w:val="yellow"/>
+        </w:rPr>
+        <w:t xml:space="preserve">Advise on financial reporting structure, management reporting, and accounting policy</w:t>
+      </w:r>
+    </w:p>
+    <w:p>
+      <w:pPr>
+        <w:pStyle w:val="CLALTRNormal"/>
+        <w:numPr>
+          <w:ilvl w:val="0"/>
+          <w:numId w:val="10"/>
+        </w:numPr>
+        <w:jc w:val="both"/>
+      </w:pPr>
+      <w:r>
+        <w:rPr>
+          <w:highlight w:val="yellow"/>
+        </w:rPr>
+        <w:t xml:space="preserve">Lead budgeting, forecasting, and long-term financial modeling to support growth and scenario planning</w:t>
+      </w:r>
+    </w:p>
+    <w:p>
+      <w:pPr>
+        <w:pStyle w:val="CLALTRNormal"/>
+        <w:numPr>
+          <w:ilvl w:val="0"/>
+          <w:numId w:val="10"/>
+        </w:numPr>
+        <w:jc w:val="both"/>
+      </w:pPr>
+      <w:r>
+        <w:rPr>
+          <w:highlight w:val="yellow"/>
+        </w:rPr>
+        <w:t xml:space="preserve">Support financing activities — preparing lender packages, tracking loan covenants, and assisting with bank negotiations</w:t>
+      </w:r>
+    </w:p>
+    <w:p>
+      <w:pPr>
+        <w:pStyle w:val="CLALTRNormal"/>
+        <w:numPr>
+          <w:ilvl w:val="0"/>
+          <w:numId w:val="10"/>
+        </w:numPr>
+        <w:jc w:val="both"/>
+      </w:pPr>
+      <w:r>
+        <w:rPr>
+          <w:highlight w:val="yellow"/>
+        </w:rPr>
+        <w:t xml:space="preserve">Provide periodic discussions with ownership and management to share insight and perspective as financial questions arise</w:t>
       </w:r>
     </w:p>
     <w:p>

</xml_diff>

<commit_message>
Apply Steven's general edits from the Korman client version
- Amendment standard loosened to allow email agreement (no signature/addendum):
  intro clause, 'Adjusting your services', and 'Our service commitment'
- Address the letter to the entity only (removed Governance Group/Management line)
- Cover: pull tagline left (hanging indent) and make proof points a vertical
  bulleted list (Bookkeeping support / Controller-level oversight / Review &
  audit readiness / CFO Level Advisory)
- Employment provision: fees updated to $200k CFO / $150k controller / $100k
  staff; solicitation window 60 -> 90 days
- Applied to hourly, fixed, and master versions

Co-Authored-By: Claude Opus 4.8 <noreply@anthropic.com>
Claude-Session: https://claude.ai/code/session_01DN4EejCmNTZeYY4X9coMuA
</commit_message>
<xml_diff>
--- a/Onyx_Engagement_Letter_FIXED.docx
+++ b/Onyx_Engagement_Letter_FIXED.docx
@@ -258,7 +258,7 @@
     <w:p>
       <w:pPr>
         <w:pStyle w:val="CLAProNormalNoSpaceAfter"/>
-        <w:ind w:left="4140"/>
+        <w:ind w:left="4140" w:hanging="4590"/>
       </w:pPr>
       <w:r>
         <w:rPr>
@@ -270,10 +270,37 @@
     <w:p>
       <w:pPr>
         <w:pStyle w:val="CLAProNormalNoSpaceAfter"/>
-        <w:ind w:left="4140"/>
-      </w:pPr>
-      <w:r>
-        <w:t xml:space="preserve">Day-to-day bookkeeping   ·   Controller-level oversight   ·   Cash-flow management   ·   Always-on advisory</w:t>
+        <w:ind w:left="4140" w:hanging="4590"/>
+      </w:pPr>
+      <w:r>
+        <w:t xml:space="preserve">·   Bookkeeping support</w:t>
+      </w:r>
+    </w:p>
+    <w:p>
+      <w:pPr>
+        <w:pStyle w:val="CLAProNormalNoSpaceAfter"/>
+        <w:ind w:left="4140" w:hanging="4590"/>
+      </w:pPr>
+      <w:r>
+        <w:t xml:space="preserve">·   Controller-level oversight</w:t>
+      </w:r>
+    </w:p>
+    <w:p>
+      <w:pPr>
+        <w:pStyle w:val="CLAProNormalNoSpaceAfter"/>
+        <w:ind w:left="4140" w:hanging="4590"/>
+      </w:pPr>
+      <w:r>
+        <w:t xml:space="preserve">·   Review &amp; audit readiness</w:t>
+      </w:r>
+    </w:p>
+    <w:p>
+      <w:pPr>
+        <w:pStyle w:val="CLAProNormalNoSpaceAfter"/>
+        <w:ind w:left="4140" w:hanging="4590"/>
+      </w:pPr>
+      <w:r>
+        <w:t xml:space="preserve">·   CFO Level Advisory</w:t>
       </w:r>
     </w:p>
     <w:p>
@@ -422,78 +449,6 @@
         <w:pStyle w:val="CLALTRAddressorSignature"/>
       </w:pPr>
       <w:r>
-        <w:rPr>
-          <w:highlight w:val="yellow"/>
-        </w:rPr>
-        <w:fldChar w:fldCharType="begin">
-          <w:ffData>
-            <w:name w:val="Text36"/>
-            <w:enabled/>
-            <w:calcOnExit w:val="0"/>
-            <w:textInput>
-              <w:default w:val="[Insert Governance Group Name]"/>
-            </w:textInput>
-          </w:ffData>
-        </w:fldChar>
-      </w:r>
-      <w:r>
-        <w:rPr>
-          <w:highlight w:val="yellow"/>
-        </w:rPr>
-        <w:instrText xml:space="preserve"> FORMTEXT </w:instrText>
-      </w:r>
-      <w:r>
-        <w:rPr>
-          <w:highlight w:val="yellow"/>
-        </w:rPr>
-      </w:r>
-      <w:r>
-        <w:rPr>
-          <w:highlight w:val="yellow"/>
-        </w:rPr>
-        <w:fldChar w:fldCharType="separate"/>
-      </w:r>
-      <w:r>
-        <w:rPr>
-          <w:noProof/>
-          <w:highlight w:val="yellow"/>
-        </w:rPr>
-        <w:t>[Insert Governance Group Name]</w:t>
-      </w:r>
-      <w:r>
-        <w:rPr>
-          <w:highlight w:val="yellow"/>
-        </w:rPr>
-        <w:fldChar w:fldCharType="end"/>
-      </w:r>
-      <w:bookmarkEnd w:id="1"/>
-      <w:r>
-        <w:rPr>
-          <w:highlight w:val="yellow"/>
-        </w:rPr>
-        <w:t xml:space="preserve"> and</w:t>
-      </w:r>
-      <w:r>
-        <w:t xml:space="preserve"> Management</w:t>
-      </w:r>
-      <w:r>
-        <w:rPr>
-          <w:rStyle w:val="CLALTRHiddenTextChar"/>
-        </w:rPr>
-        <w:t xml:space="preserve"> </w:t>
-      </w:r>
-      <w:r>
-        <w:rPr>
-          <w:rStyle w:val="CLALTRHiddenTextChar"/>
-        </w:rPr>
-        <w:t xml:space="preserve">   </w:t>
-      </w:r>
-    </w:p>
-    <w:p>
-      <w:pPr>
-        <w:pStyle w:val="CLALTRAddressorSignature"/>
-      </w:pPr>
-      <w:r>
         <w:fldChar w:fldCharType="begin">
           <w:ffData>
             <w:name w:val="Text46"/>
@@ -880,7 +835,7 @@
         <w:rPr>
           <w:b/>
         </w:rPr>
-        <w:t>signed by both ONYX and the Client</w:t>
+        <w:t>including by email, agreed to by both ONYX and the Client</w:t>
       </w:r>
       <w:r>
         <w:t>.</w:t>
@@ -1783,7 +1738,7 @@
         <w:jc w:val="both"/>
       </w:pPr>
       <w:r>
-        <w:t xml:space="preserve">Your needs will evolve as your business grows, and this engagement is built to flex with them. Services can be added, reduced, or adjusted at any time by mutual written agreement — typically a brief addendum to this letter rather than a new engagement letter — with fees adjusted accordingly. All other terms of this agreement remain in effect, so adding or removing a service never requires starting over.</w:t>
+        <w:t xml:space="preserve">Your needs will evolve as your business grows, and this engagement is built to flex with them. Services can be added, reduced, or adjusted at any time by mutual written agreement — including by email, with no formal addendum or new engagement letter required. All other terms of this agreement remain in effect, so adding or removing a service never requires starting over.</w:t>
       </w:r>
     </w:p>
     <w:p>
@@ -2976,7 +2931,7 @@
         <w:jc w:val="both"/>
       </w:pPr>
       <w:r>
-        <w:t xml:space="preserve">To ensure that ONYX’s services remain responsive to the Client’s needs, and fair to both parties, ONYX will meet with the Client throughout the term of this agreement and, as needs change, revise or adjust the scope of services and the related fees — without the need to re-execute this agreement. Such revisions or adjustments are not binding unless made in writing and signed by both ONYX and the Client.</w:t>
+        <w:t xml:space="preserve">To ensure that ONYX’s services remain responsive to the Client’s needs, and fair to both parties, ONYX will meet with the Client throughout the term of this agreement and, as needs change, revise or adjust the scope of services and the related fees — without the need to re-execute this agreement. Such revisions or adjustments take effect once confirmed in writing, including by email, by both ONYX and the Client; no signature, formal addendum, or re-execution of this agreement is required.</w:t>
       </w:r>
     </w:p>
     <w:p>
@@ -4107,7 +4062,7 @@
         <w:rPr>
           <w:highlight w:val="yellow"/>
         </w:rPr>
-        <w:t>$60,000 for the controller and $25,000 for the staff</w:t>
+        <w:t>$200,000 for the CFO, $150,000 for the controller, and $100,000 for the staff</w:t>
       </w:r>
       <w:r>
         <w:t xml:space="preserve"> to </w:t>
@@ -4145,7 +4100,7 @@
         <w:t xml:space="preserve"> within</w:t>
       </w:r>
       <w:r>
-        <w:t xml:space="preserve"> sixty</w:t>
+        <w:t xml:space="preserve"> ninety</w:t>
       </w:r>
       <w:r>
         <w:t xml:space="preserve"> </w:t>
@@ -4154,7 +4109,7 @@
         <w:t>(</w:t>
       </w:r>
       <w:r>
-        <w:t>60</w:t>
+        <w:t>90</w:t>
       </w:r>
       <w:r>
         <w:t>)</w:t>

</xml_diff>

<commit_message>
Add Section 1/Section 2 banner treatment (Steven's transcript vision)
Big bordered section banners: 'Section 1 - What we'll do for you' and
'Section 2 - Terms and Conditions' (24pt title + label, top/bottom rules) so
the pitch and the T&Cs read as two distinct numbered parts. Applied to hourly,
fixed, and master templates. Walkthrough updated for this round.

Co-Authored-By: Claude Opus 4.8 <noreply@anthropic.com>
Claude-Session: https://claude.ai/code/session_01DN4EejCmNTZeYY4X9coMuA
</commit_message>
<xml_diff>
--- a/Onyx_Engagement_Letter_FIXED.docx
+++ b/Onyx_Engagement_Letter_FIXED.docx
@@ -844,9 +844,31 @@
     <w:p>
       <w:pPr>
         <w:pStyle w:val="CLALTRHeading1"/>
-        <w:jc w:val="both"/>
-      </w:pPr>
-      <w:r>
+        <w:pBdr>
+          <w:top w:val="single" w:sz="8" w:space="10" w:color="auto"/>
+          <w:bottom w:val="single" w:sz="8" w:space="10" w:color="auto"/>
+        </w:pBdr>
+        <w:spacing w:before="240" w:after="200"/>
+        <w:jc w:val="both"/>
+      </w:pPr>
+      <w:r>
+        <w:rPr>
+          <w:caps/>
+          <w:color w:val="7F7F7F"/>
+          <w:sz w:val="18"/>
+          <w:szCs w:val="18"/>
+          <w:spacing w:val="60"/>
+        </w:rPr>
+        <w:t xml:space="preserve">Section 1</w:t>
+      </w:r>
+      <w:r>
+        <w:br/>
+      </w:r>
+      <w:r>
+        <w:rPr>
+          <w:sz w:val="48"/>
+          <w:szCs w:val="48"/>
+        </w:rPr>
         <w:t xml:space="preserve">What we’ll do for you</w:t>
       </w:r>
     </w:p>
@@ -2973,9 +2995,31 @@
       <w:pPr>
         <w:pStyle w:val="CLALTRHeading1"/>
         <w:pageBreakBefore/>
-        <w:jc w:val="both"/>
-      </w:pPr>
-      <w:r>
+        <w:pBdr>
+          <w:top w:val="single" w:sz="8" w:space="10" w:color="auto"/>
+          <w:bottom w:val="single" w:sz="8" w:space="10" w:color="auto"/>
+        </w:pBdr>
+        <w:spacing w:before="240" w:after="200"/>
+        <w:jc w:val="both"/>
+      </w:pPr>
+      <w:r>
+        <w:rPr>
+          <w:caps/>
+          <w:color w:val="7F7F7F"/>
+          <w:sz w:val="18"/>
+          <w:szCs w:val="18"/>
+          <w:spacing w:val="60"/>
+        </w:rPr>
+        <w:t xml:space="preserve">Section 2</w:t>
+      </w:r>
+      <w:r>
+        <w:br/>
+      </w:r>
+      <w:r>
+        <w:rPr>
+          <w:sz w:val="48"/>
+          <w:szCs w:val="48"/>
+        </w:rPr>
         <w:t xml:space="preserve">Terms and Conditions</w:t>
       </w:r>
     </w:p>

</xml_diff>

<commit_message>
Add 7-year record-retention clause to Other provisions
Adds a record-retention provision (7-year workpaper retention, ONYX workpaper
ownership, return of client originals on request, client's own retention
responsibility, electronic-form allowance) to the hourly, fixed, and master
templates.

Co-Authored-By: Claude Opus 4.8 <noreply@anthropic.com>
Claude-Session: https://claude.ai/code/session_01DN4EejCmNTZeYY4X9coMuA
</commit_message>
<xml_diff>
--- a/Onyx_Engagement_Letter_FIXED.docx
+++ b/Onyx_Engagement_Letter_FIXED.docx
@@ -3997,6 +3997,21 @@
       </w:r>
       <w:r>
         <w:t>to ONYX that he, she, or it has all requisite power and authority to engage ONYX and bind the business entity Client to the terms of this letter and that the Client on whose behalf the letter is signed has/have duly taken all necessary and proper corporate or other actions to engage ONYX pursuant to the terms of this letter.</w:t>
+      </w:r>
+    </w:p>
+    <w:p>
+      <w:pPr>
+        <w:pStyle w:val="CLALTRNormal"/>
+        <w:jc w:val="both"/>
+      </w:pPr>
+      <w:r>
+        <w:rPr>
+          <w:b/>
+        </w:rPr>
+        <w:t xml:space="preserve">Record retention.  </w:t>
+      </w:r>
+      <w:r>
+        <w:t xml:space="preserve">ONYX will retain its working papers, supporting schedules, and other documentation prepared in connection with this engagement for a period of seven (7) years from the completion of the applicable services, after which ONYX may destroy or otherwise dispose of such records without further notice to the Client. Working papers and other documents prepared by ONYX in the course of the engagement remain the property of ONYX. Original records, source documents, and other materials furnished by the Client remain the property of the Client and will be returned upon written request. The Client is responsible for maintaining its own copies of its records and for meeting its own record-retention obligations. ONYX has no obligation to retain any records or data beyond the seven (7) year period and may maintain such records in electronic form.</w:t>
       </w:r>
     </w:p>
     <w:p>

</xml_diff>

<commit_message>
Add 7-year record-retention clause to base templates
Added a 'Record retention.' provision as the final paragraph of the
'Other provisions' section (immediately before 'Employment provision')
in the hourly, fixed, and master (REVISED) templates, with a bold
run-in lead. Covers ONYX's 7-year retention of working papers, ownership
of work product, return of client-furnished originals, and the client's
own retention obligations.

Co-Authored-By: Claude Opus 4.8 <noreply@anthropic.com>
Claude-Session: https://claude.ai/code/session_01RfN2m1kgBo1xCWLXRNw2zV
</commit_message>
<xml_diff>
--- a/Onyx_Engagement_Letter_FIXED.docx
+++ b/Onyx_Engagement_Letter_FIXED.docx
@@ -3998,6 +3998,24 @@
       </w:r>
       <w:r>
         <w:t>to ONYX that he, she, or it has all requisite power and authority to engage ONYX and bind the business entity Client to the terms of this letter and that the Client on whose behalf the letter is signed has/have duly taken all necessary and proper corporate or other actions to engage ONYX pursuant to the terms of this letter.</w:t>
+      </w:r>
+    </w:p>
+    <w:p>
+      <w:pPr>
+        <w:pStyle w:val="CLALTRNormal"/>
+        <w:jc w:val="both"/>
+      </w:pPr>
+      <w:r>
+        <w:rPr>
+          <w:b/>
+        </w:rPr>
+        <w:t>Record retention.</w:t>
+      </w:r>
+      <w:r>
+        <w:rPr>
+          <w:b w:val="0"/>
+        </w:rPr>
+        <w:t xml:space="preserve"> ONYX will retain its working papers, supporting schedules, and other documentation prepared in connection with this engagement for a period of seven (7) years from the completion of the applicable services, after which ONYX may destroy or otherwise dispose of such records without further notice to the Client. Working papers and other documents prepared by ONYX in the course of the engagement remain the property of ONYX. Original records, source documents, and other materials furnished by the Client remain the property of the Client and will be returned upon written request. The Client is responsible for maintaining its own copies of its records and for meeting its own record-retention obligations. ONYX has no obligation to retain any records or data beyond the seven (7) year period and may maintain such records in electronic form.</w:t>
       </w:r>
     </w:p>
     <w:p>

</xml_diff>